<commit_message>
feat: sheets print on their own paper, slides on pages of their size
SheetMetadata.pageSetup holds a sheet's print setup (XLSX pageSetup and
pageMargins; an ODS sheet's master page, or the Default page style), and
a presentation's page is its slide size (PPTX sldSz, ODP's page layout,
size alone). The native PDF engine prints each sheet on its own pages,
and a sheet without a setup on the document's.
</commit_message>
<xml_diff>
--- a/test/generator/baseline/gen.pptx.to.docx.docx
+++ b/test/generator/baseline/gen.pptx.to.docx.docx
@@ -578,8 +578,8 @@
         </w:tblBorders>
       </w:tblPr>
       <w:tblGrid>
-        <w:gridCol w:w="4513"/>
-        <w:gridCol w:w="4513"/>
+        <w:gridCol w:w="8160"/>
+        <w:gridCol w:w="8160"/>
       </w:tblGrid>
       <w:tr>
         <w:tc>
@@ -821,12 +821,12 @@
         </w:tblBorders>
       </w:tblPr>
       <w:tblGrid>
-        <w:gridCol w:w="1504"/>
-        <w:gridCol w:w="1504"/>
-        <w:gridCol w:w="1504"/>
-        <w:gridCol w:w="1504"/>
-        <w:gridCol w:w="1504"/>
-        <w:gridCol w:w="1504"/>
+        <w:gridCol w:w="2720"/>
+        <w:gridCol w:w="2720"/>
+        <w:gridCol w:w="2720"/>
+        <w:gridCol w:w="2720"/>
+        <w:gridCol w:w="2720"/>
+        <w:gridCol w:w="2720"/>
       </w:tblGrid>
       <w:tr>
         <w:tc>
@@ -1399,10 +1399,10 @@
         </w:tblBorders>
       </w:tblPr>
       <w:tblGrid>
-        <w:gridCol w:w="2256"/>
-        <w:gridCol w:w="2256"/>
-        <w:gridCol w:w="2256"/>
-        <w:gridCol w:w="2256"/>
+        <w:gridCol w:w="4080"/>
+        <w:gridCol w:w="4080"/>
+        <w:gridCol w:w="4080"/>
+        <w:gridCol w:w="4080"/>
       </w:tblGrid>
       <w:tr>
         <w:tc>
@@ -1960,8 +1960,8 @@
         </w:tblBorders>
       </w:tblPr>
       <w:tblGrid>
-        <w:gridCol w:w="4513"/>
-        <w:gridCol w:w="4513"/>
+        <w:gridCol w:w="8160"/>
+        <w:gridCol w:w="8160"/>
       </w:tblGrid>
       <w:tr>
         <w:tc>
@@ -2039,8 +2039,8 @@
         </w:tblBorders>
       </w:tblPr>
       <w:tblGrid>
-        <w:gridCol w:w="4513"/>
-        <w:gridCol w:w="4513"/>
+        <w:gridCol w:w="8160"/>
+        <w:gridCol w:w="8160"/>
       </w:tblGrid>
       <w:tr>
         <w:tc>
@@ -2115,20 +2115,20 @@
         </w:tblBorders>
       </w:tblPr>
       <w:tblGrid>
-        <w:gridCol w:w="644"/>
-        <w:gridCol w:w="644"/>
-        <w:gridCol w:w="644"/>
-        <w:gridCol w:w="644"/>
-        <w:gridCol w:w="644"/>
-        <w:gridCol w:w="644"/>
-        <w:gridCol w:w="644"/>
-        <w:gridCol w:w="644"/>
-        <w:gridCol w:w="644"/>
-        <w:gridCol w:w="644"/>
-        <w:gridCol w:w="644"/>
-        <w:gridCol w:w="644"/>
-        <w:gridCol w:w="644"/>
-        <w:gridCol w:w="644"/>
+        <w:gridCol w:w="1165"/>
+        <w:gridCol w:w="1165"/>
+        <w:gridCol w:w="1165"/>
+        <w:gridCol w:w="1165"/>
+        <w:gridCol w:w="1165"/>
+        <w:gridCol w:w="1165"/>
+        <w:gridCol w:w="1165"/>
+        <w:gridCol w:w="1165"/>
+        <w:gridCol w:w="1165"/>
+        <w:gridCol w:w="1165"/>
+        <w:gridCol w:w="1165"/>
+        <w:gridCol w:w="1165"/>
+        <w:gridCol w:w="1165"/>
+        <w:gridCol w:w="1165"/>
       </w:tblGrid>
       <w:tr>
         <w:tc>
@@ -4917,7 +4917,7 @@
       <w:r>
         <w:drawing>
           <wp:inline distT="0" distB="0" distL="0" distR="0">
-            <wp:extent cx="5731510" cy="5731510"/>
+            <wp:extent cx="10287000" cy="10287000"/>
             <wp:docPr id="1" name="image1" descr="165 Inspirational Quotes To Keep You Motivated In Life"/>
             <a:graphic xmlns:a="http://schemas.openxmlformats.org/drawingml/2006/main">
               <a:graphicData uri="http://schemas.openxmlformats.org/drawingml/2006/picture">
@@ -4935,7 +4935,7 @@
                   <pic:spPr>
                     <a:xfrm>
                       <a:off x="0" y="0"/>
-                      <a:ext cx="5731510" cy="5731510"/>
+                      <a:ext cx="10287000" cy="10287000"/>
                     </a:xfrm>
                     <a:prstGeom prst="rect">
                       <a:avLst/>
@@ -5399,10 +5399,10 @@
         </w:tblBorders>
       </w:tblPr>
       <w:tblGrid>
-        <w:gridCol w:w="2256"/>
-        <w:gridCol w:w="2256"/>
-        <w:gridCol w:w="2256"/>
-        <w:gridCol w:w="2256"/>
+        <w:gridCol w:w="4080"/>
+        <w:gridCol w:w="4080"/>
+        <w:gridCol w:w="4080"/>
+        <w:gridCol w:w="4080"/>
       </w:tblGrid>
       <w:tr>
         <w:tc>
@@ -5612,7 +5612,7 @@
       </w:tr>
     </w:tbl>
     <w:sectPr>
-      <w:pgSz w:w="11906" w:h="16838"/>
+      <w:pgSz w:w="19200" w:h="10800" w:orient="landscape"/>
       <w:pgMar w:top="1440" w:right="1440" w:bottom="1440" w:left="1440" w:header="708" w:footer="708" w:gutter="0"/>
     </w:sectPr>
   </w:body>

</xml_diff>

<commit_message>
fix(pptx): merged table cells read with their spans
A cell's gridSpan and rowSpan are its colSpan and rowSpan, and the positions it covers (hMerge, vMerge) are no cells of their own: they were read as empty cells, and the merge was lost.
</commit_message>
<xml_diff>
--- a/test/generator/baseline/gen.pptx.to.docx.docx
+++ b/test/generator/baseline/gen.pptx.to.docx.docx
@@ -2031,6 +2031,7 @@
         <w:tc>
           <w:tcPr>
             <w:tcW w:w="0" w:type="auto"/>
+            <w:vMerge w:val="restart"/>
           </w:tcPr>
           <w:p>
             <w:r>
@@ -2070,6 +2071,7 @@
         <w:tc>
           <w:tcPr>
             <w:tcW w:w="0" w:type="auto"/>
+            <w:vMerge/>
           </w:tcPr>
           <w:p/>
         </w:tc>
@@ -2201,6 +2203,7 @@
         <w:tc>
           <w:tcPr>
             <w:tcW w:w="0" w:type="auto"/>
+            <w:gridSpan w:val="13"/>
           </w:tcPr>
           <w:p>
             <w:r>
@@ -2212,78 +2215,6 @@
               <w:t xml:space="preserve">December 2007 </w:t>
             </w:r>
           </w:p>
-        </w:tc>
-        <w:tc>
-          <w:tcPr>
-            <w:tcW w:w="0" w:type="auto"/>
-          </w:tcPr>
-          <w:p/>
-        </w:tc>
-        <w:tc>
-          <w:tcPr>
-            <w:tcW w:w="0" w:type="auto"/>
-          </w:tcPr>
-          <w:p/>
-        </w:tc>
-        <w:tc>
-          <w:tcPr>
-            <w:tcW w:w="0" w:type="auto"/>
-          </w:tcPr>
-          <w:p/>
-        </w:tc>
-        <w:tc>
-          <w:tcPr>
-            <w:tcW w:w="0" w:type="auto"/>
-          </w:tcPr>
-          <w:p/>
-        </w:tc>
-        <w:tc>
-          <w:tcPr>
-            <w:tcW w:w="0" w:type="auto"/>
-          </w:tcPr>
-          <w:p/>
-        </w:tc>
-        <w:tc>
-          <w:tcPr>
-            <w:tcW w:w="0" w:type="auto"/>
-          </w:tcPr>
-          <w:p/>
-        </w:tc>
-        <w:tc>
-          <w:tcPr>
-            <w:tcW w:w="0" w:type="auto"/>
-          </w:tcPr>
-          <w:p/>
-        </w:tc>
-        <w:tc>
-          <w:tcPr>
-            <w:tcW w:w="0" w:type="auto"/>
-          </w:tcPr>
-          <w:p/>
-        </w:tc>
-        <w:tc>
-          <w:tcPr>
-            <w:tcW w:w="0" w:type="auto"/>
-          </w:tcPr>
-          <w:p/>
-        </w:tc>
-        <w:tc>
-          <w:tcPr>
-            <w:tcW w:w="0" w:type="auto"/>
-          </w:tcPr>
-          <w:p/>
-        </w:tc>
-        <w:tc>
-          <w:tcPr>
-            <w:tcW w:w="0" w:type="auto"/>
-          </w:tcPr>
-          <w:p/>
-        </w:tc>
-        <w:tc>
-          <w:tcPr>
-            <w:tcW w:w="0" w:type="auto"/>
-          </w:tcPr>
-          <w:p/>
         </w:tc>
         <w:tc>
           <w:tcPr>
@@ -2476,6 +2407,7 @@
         <w:tc>
           <w:tcPr>
             <w:tcW w:w="0" w:type="auto"/>
+            <w:gridSpan w:val="2"/>
           </w:tcPr>
           <w:p>
             <w:r>
@@ -2487,12 +2419,6 @@
               <w:t xml:space="preserve">Sat </w:t>
             </w:r>
           </w:p>
-        </w:tc>
-        <w:tc>
-          <w:tcPr>
-            <w:tcW w:w="0" w:type="auto"/>
-          </w:tcPr>
-          <w:p/>
         </w:tc>
       </w:tr>
       <w:tr>
@@ -2679,6 +2605,7 @@
         <w:tc>
           <w:tcPr>
             <w:tcW w:w="0" w:type="auto"/>
+            <w:gridSpan w:val="2"/>
           </w:tcPr>
           <w:p>
             <w:r>
@@ -2690,12 +2617,6 @@
               <w:t xml:space="preserve">1 </w:t>
             </w:r>
           </w:p>
-        </w:tc>
-        <w:tc>
-          <w:tcPr>
-            <w:tcW w:w="0" w:type="auto"/>
-          </w:tcPr>
-          <w:p/>
         </w:tc>
       </w:tr>
       <w:tr>
@@ -2882,23 +2803,18 @@
         <w:tc>
           <w:tcPr>
             <w:tcW w:w="0" w:type="auto"/>
-          </w:tcPr>
-          <w:p>
-            <w:r>
-              <w:rPr>
-                <w:rFonts w:ascii="Ubuntu" w:hAnsi="Ubuntu"/>
-                <w:color w:val="7F7F7F"/>
-                <w:sz w:val="24"/>
-              </w:rPr>
-              <w:t xml:space="preserve"> </w:t>
-            </w:r>
-          </w:p>
-        </w:tc>
-        <w:tc>
-          <w:tcPr>
-            <w:tcW w:w="0" w:type="auto"/>
-          </w:tcPr>
-          <w:p/>
+            <w:gridSpan w:val="2"/>
+          </w:tcPr>
+          <w:p>
+            <w:r>
+              <w:rPr>
+                <w:rFonts w:ascii="Ubuntu" w:hAnsi="Ubuntu"/>
+                <w:color w:val="7F7F7F"/>
+                <w:sz w:val="24"/>
+              </w:rPr>
+              <w:t xml:space="preserve"> </w:t>
+            </w:r>
+          </w:p>
         </w:tc>
       </w:tr>
       <w:tr>
@@ -3085,6 +3001,7 @@
         <w:tc>
           <w:tcPr>
             <w:tcW w:w="0" w:type="auto"/>
+            <w:gridSpan w:val="2"/>
           </w:tcPr>
           <w:p>
             <w:r>
@@ -3096,12 +3013,6 @@
               <w:t xml:space="preserve">8 </w:t>
             </w:r>
           </w:p>
-        </w:tc>
-        <w:tc>
-          <w:tcPr>
-            <w:tcW w:w="0" w:type="auto"/>
-          </w:tcPr>
-          <w:p/>
         </w:tc>
       </w:tr>
       <w:tr>
@@ -3288,23 +3199,18 @@
         <w:tc>
           <w:tcPr>
             <w:tcW w:w="0" w:type="auto"/>
-          </w:tcPr>
-          <w:p>
-            <w:r>
-              <w:rPr>
-                <w:rFonts w:ascii="Ubuntu" w:hAnsi="Ubuntu"/>
-                <w:color w:val="7F7F7F"/>
-                <w:sz w:val="24"/>
-              </w:rPr>
-              <w:t xml:space="preserve"> </w:t>
-            </w:r>
-          </w:p>
-        </w:tc>
-        <w:tc>
-          <w:tcPr>
-            <w:tcW w:w="0" w:type="auto"/>
-          </w:tcPr>
-          <w:p/>
+            <w:gridSpan w:val="2"/>
+          </w:tcPr>
+          <w:p>
+            <w:r>
+              <w:rPr>
+                <w:rFonts w:ascii="Ubuntu" w:hAnsi="Ubuntu"/>
+                <w:color w:val="7F7F7F"/>
+                <w:sz w:val="24"/>
+              </w:rPr>
+              <w:t xml:space="preserve"> </w:t>
+            </w:r>
+          </w:p>
         </w:tc>
       </w:tr>
       <w:tr>
@@ -3491,6 +3397,7 @@
         <w:tc>
           <w:tcPr>
             <w:tcW w:w="0" w:type="auto"/>
+            <w:gridSpan w:val="2"/>
           </w:tcPr>
           <w:p>
             <w:r>
@@ -3502,12 +3409,6 @@
               <w:t xml:space="preserve">15 </w:t>
             </w:r>
           </w:p>
-        </w:tc>
-        <w:tc>
-          <w:tcPr>
-            <w:tcW w:w="0" w:type="auto"/>
-          </w:tcPr>
-          <w:p/>
         </w:tc>
       </w:tr>
       <w:tr>
@@ -3694,23 +3595,18 @@
         <w:tc>
           <w:tcPr>
             <w:tcW w:w="0" w:type="auto"/>
-          </w:tcPr>
-          <w:p>
-            <w:r>
-              <w:rPr>
-                <w:rFonts w:ascii="Ubuntu" w:hAnsi="Ubuntu"/>
-                <w:color w:val="7F7F7F"/>
-                <w:sz w:val="24"/>
-              </w:rPr>
-              <w:t xml:space="preserve"> </w:t>
-            </w:r>
-          </w:p>
-        </w:tc>
-        <w:tc>
-          <w:tcPr>
-            <w:tcW w:w="0" w:type="auto"/>
-          </w:tcPr>
-          <w:p/>
+            <w:gridSpan w:val="2"/>
+          </w:tcPr>
+          <w:p>
+            <w:r>
+              <w:rPr>
+                <w:rFonts w:ascii="Ubuntu" w:hAnsi="Ubuntu"/>
+                <w:color w:val="7F7F7F"/>
+                <w:sz w:val="24"/>
+              </w:rPr>
+              <w:t xml:space="preserve"> </w:t>
+            </w:r>
+          </w:p>
         </w:tc>
       </w:tr>
       <w:tr>
@@ -3897,6 +3793,7 @@
         <w:tc>
           <w:tcPr>
             <w:tcW w:w="0" w:type="auto"/>
+            <w:gridSpan w:val="2"/>
           </w:tcPr>
           <w:p>
             <w:r>
@@ -3908,12 +3805,6 @@
               <w:t xml:space="preserve">22 </w:t>
             </w:r>
           </w:p>
-        </w:tc>
-        <w:tc>
-          <w:tcPr>
-            <w:tcW w:w="0" w:type="auto"/>
-          </w:tcPr>
-          <w:p/>
         </w:tc>
       </w:tr>
       <w:tr>
@@ -4100,23 +3991,18 @@
         <w:tc>
           <w:tcPr>
             <w:tcW w:w="0" w:type="auto"/>
-          </w:tcPr>
-          <w:p>
-            <w:r>
-              <w:rPr>
-                <w:rFonts w:ascii="Ubuntu" w:hAnsi="Ubuntu"/>
-                <w:color w:val="7F7F7F"/>
-                <w:sz w:val="24"/>
-              </w:rPr>
-              <w:t xml:space="preserve"> </w:t>
-            </w:r>
-          </w:p>
-        </w:tc>
-        <w:tc>
-          <w:tcPr>
-            <w:tcW w:w="0" w:type="auto"/>
-          </w:tcPr>
-          <w:p/>
+            <w:gridSpan w:val="2"/>
+          </w:tcPr>
+          <w:p>
+            <w:r>
+              <w:rPr>
+                <w:rFonts w:ascii="Ubuntu" w:hAnsi="Ubuntu"/>
+                <w:color w:val="7F7F7F"/>
+                <w:sz w:val="24"/>
+              </w:rPr>
+              <w:t xml:space="preserve"> </w:t>
+            </w:r>
+          </w:p>
         </w:tc>
       </w:tr>
       <w:tr>
@@ -4303,6 +4189,7 @@
         <w:tc>
           <w:tcPr>
             <w:tcW w:w="0" w:type="auto"/>
+            <w:gridSpan w:val="2"/>
           </w:tcPr>
           <w:p>
             <w:r>
@@ -4314,12 +4201,6 @@
               <w:t xml:space="preserve">29 </w:t>
             </w:r>
           </w:p>
-        </w:tc>
-        <w:tc>
-          <w:tcPr>
-            <w:tcW w:w="0" w:type="auto"/>
-          </w:tcPr>
-          <w:p/>
         </w:tc>
       </w:tr>
       <w:tr>
@@ -4506,23 +4387,18 @@
         <w:tc>
           <w:tcPr>
             <w:tcW w:w="0" w:type="auto"/>
-          </w:tcPr>
-          <w:p>
-            <w:r>
-              <w:rPr>
-                <w:rFonts w:ascii="Ubuntu" w:hAnsi="Ubuntu"/>
-                <w:color w:val="7F7F7F"/>
-                <w:sz w:val="24"/>
-              </w:rPr>
-              <w:t xml:space="preserve"> </w:t>
-            </w:r>
-          </w:p>
-        </w:tc>
-        <w:tc>
-          <w:tcPr>
-            <w:tcW w:w="0" w:type="auto"/>
-          </w:tcPr>
-          <w:p/>
+            <w:gridSpan w:val="2"/>
+          </w:tcPr>
+          <w:p>
+            <w:r>
+              <w:rPr>
+                <w:rFonts w:ascii="Ubuntu" w:hAnsi="Ubuntu"/>
+                <w:color w:val="7F7F7F"/>
+                <w:sz w:val="24"/>
+              </w:rPr>
+              <w:t xml:space="preserve"> </w:t>
+            </w:r>
+          </w:p>
         </w:tc>
       </w:tr>
       <w:tr>
@@ -4709,23 +4585,18 @@
         <w:tc>
           <w:tcPr>
             <w:tcW w:w="0" w:type="auto"/>
-          </w:tcPr>
-          <w:p>
-            <w:r>
-              <w:rPr>
-                <w:rFonts w:ascii="Ubuntu" w:hAnsi="Ubuntu"/>
-                <w:color w:val="7F7F7F"/>
-                <w:sz w:val="24"/>
-              </w:rPr>
-              <w:t xml:space="preserve"> </w:t>
-            </w:r>
-          </w:p>
-        </w:tc>
-        <w:tc>
-          <w:tcPr>
-            <w:tcW w:w="0" w:type="auto"/>
-          </w:tcPr>
-          <w:p/>
+            <w:gridSpan w:val="2"/>
+          </w:tcPr>
+          <w:p>
+            <w:r>
+              <w:rPr>
+                <w:rFonts w:ascii="Ubuntu" w:hAnsi="Ubuntu"/>
+                <w:color w:val="7F7F7F"/>
+                <w:sz w:val="24"/>
+              </w:rPr>
+              <w:t xml:space="preserve"> </w:t>
+            </w:r>
+          </w:p>
         </w:tc>
       </w:tr>
     </w:tbl>

</xml_diff>

<commit_message>
feat(pdf): keepHeadersAndFootersInPages keeps running headers and footers in their pages
A tagged PDF marks its running headers and footers as artifacts, and they are read into auxiliary,
where writers that lay out no pages (text, Markdown, HTML, EPUB, slides) leave them out. With
pdfParserConfig.keepHeadersAndFootersInPages each page keeps its own in its content, the header before
the page's text and the footer after it, placed before the page's pictures are, for a page-faithful
result such as a slide per page. ignoreHeadersAndFooters still drops them. Baselines carry the new key
and the automatic chart titles of the last commit.
</commit_message>
<xml_diff>
--- a/test/generator/baseline/gen.pptx.to.docx.docx
+++ b/test/generator/baseline/gen.pptx.to.docx.docx
@@ -5369,6 +5369,14 @@
         <w:t xml:space="preserve">Charts</w:t>
       </w:r>
       <w:bookmarkEnd w:id="5"/>
+    </w:p>
+    <w:p>
+      <w:r>
+        <w:rPr>
+          <w:b/>
+        </w:rPr>
+        <w:t xml:space="preserve">Chart Title</w:t>
+      </w:r>
     </w:p>
     <w:tbl>
       <w:tblPr>

</xml_diff>